<commit_message>
Updated doctype DEVIS to add the US information
</commit_message>
<xml_diff>
--- a/flower_backend/doctypes/DEVIS.docx
+++ b/flower_backend/doctypes/DEVIS.docx
@@ -968,22 +968,27 @@
           <w:rFonts w:ascii="Arial" w:eastAsia="Arial" w:hAnsi="Arial" w:cs="Arial"/>
           <w:sz w:val="22"/>
           <w:szCs w:val="22"/>
+          <w:lang w:val="en-GB"/>
         </w:rPr>
       </w:pPr>
+      <w:proofErr w:type="gramStart"/>
       <w:r>
         <w:rPr>
           <w:rFonts w:ascii="Arial" w:eastAsia="Arial" w:hAnsi="Arial" w:cs="Arial"/>
           <w:b/>
           <w:sz w:val="22"/>
           <w:szCs w:val="22"/>
+          <w:lang w:val="en-GB"/>
         </w:rPr>
         <w:t>Description :</w:t>
       </w:r>
-      <w:r>
-        <w:rPr>
-          <w:rFonts w:ascii="Arial" w:eastAsia="Arial" w:hAnsi="Arial" w:cs="Arial"/>
-          <w:sz w:val="22"/>
-          <w:szCs w:val="22"/>
+      <w:proofErr w:type="gramEnd"/>
+      <w:r>
+        <w:rPr>
+          <w:rFonts w:ascii="Arial" w:eastAsia="Arial" w:hAnsi="Arial" w:cs="Arial"/>
+          <w:sz w:val="22"/>
+          <w:szCs w:val="22"/>
+          <w:lang w:val="en-GB"/>
         </w:rPr>
         <w:t xml:space="preserve"> </w:t>
       </w:r>
@@ -1004,7 +1009,38 @@
           <w:szCs w:val="22"/>
           <w:lang w:val="en-GB"/>
         </w:rPr>
-        <w:t>{{ groupe.description }}</w:t>
+        <w:t>{</w:t>
+      </w:r>
+      <w:proofErr w:type="gramStart"/>
+      <w:r>
+        <w:rPr>
+          <w:rFonts w:ascii="Arial" w:eastAsia="Arial" w:hAnsi="Arial" w:cs="Arial"/>
+          <w:sz w:val="22"/>
+          <w:szCs w:val="22"/>
+          <w:lang w:val="en-GB"/>
+        </w:rPr>
+        <w:t xml:space="preserve">{ </w:t>
+      </w:r>
+      <w:proofErr w:type="spellStart"/>
+      <w:r>
+        <w:rPr>
+          <w:rFonts w:ascii="Arial" w:eastAsia="Arial" w:hAnsi="Arial" w:cs="Arial"/>
+          <w:sz w:val="22"/>
+          <w:szCs w:val="22"/>
+          <w:lang w:val="en-GB"/>
+        </w:rPr>
+        <w:t>groupe.description</w:t>
+      </w:r>
+      <w:proofErr w:type="spellEnd"/>
+      <w:proofErr w:type="gramEnd"/>
+      <w:r>
+        <w:rPr>
+          <w:rFonts w:ascii="Arial" w:eastAsia="Arial" w:hAnsi="Arial" w:cs="Arial"/>
+          <w:sz w:val="22"/>
+          <w:szCs w:val="22"/>
+          <w:lang w:val="en-GB"/>
+        </w:rPr>
+        <w:t xml:space="preserve"> }}</w:t>
       </w:r>
     </w:p>
     <w:p>
@@ -1209,7 +1245,7 @@
       <w:tblPr>
         <w:tblStyle w:val="a"/>
         <w:tblW w:w="9463" w:type="dxa"/>
-        <w:tblInd w:w="0" w:type="dxa"/>
+        <w:tblInd w:w="20" w:type="dxa"/>
         <w:tblBorders>
           <w:top w:val="single" w:sz="4" w:space="0" w:color="000000"/>
           <w:left w:val="single" w:sz="4" w:space="0" w:color="000000"/>
@@ -1222,7 +1258,8 @@
         <w:tblLook w:val="0400" w:firstRow="0" w:lastRow="0" w:firstColumn="0" w:lastColumn="0" w:noHBand="0" w:noVBand="1"/>
       </w:tblPr>
       <w:tblGrid>
-        <w:gridCol w:w="3409"/>
+        <w:gridCol w:w="2674"/>
+        <w:gridCol w:w="735"/>
         <w:gridCol w:w="1864"/>
         <w:gridCol w:w="1907"/>
         <w:gridCol w:w="2283"/>
@@ -1231,6 +1268,7 @@
         <w:tc>
           <w:tcPr>
             <w:tcW w:w="3409" w:type="dxa"/>
+            <w:gridSpan w:val="2"/>
             <w:tcBorders>
               <w:top w:val="nil"/>
               <w:left w:val="nil"/>
@@ -1380,7 +1418,7 @@
         <w:tc>
           <w:tcPr>
             <w:tcW w:w="9463" w:type="dxa"/>
-            <w:gridSpan w:val="4"/>
+            <w:gridSpan w:val="5"/>
             <w:shd w:val="clear" w:color="auto" w:fill="8F8F8F"/>
           </w:tcPr>
           <w:p>
@@ -1532,6 +1570,7 @@
         <w:tc>
           <w:tcPr>
             <w:tcW w:w="3409" w:type="dxa"/>
+            <w:gridSpan w:val="2"/>
             <w:shd w:val="clear" w:color="auto" w:fill="auto"/>
             <w:vAlign w:val="center"/>
           </w:tcPr>
@@ -1884,7 +1923,241 @@
       <w:tr>
         <w:tc>
           <w:tcPr>
+            <w:tcW w:w="9463" w:type="dxa"/>
+            <w:gridSpan w:val="5"/>
+            <w:shd w:val="clear" w:color="auto" w:fill="auto"/>
+            <w:vAlign w:val="center"/>
+          </w:tcPr>
+          <w:p>
+            <w:pPr>
+              <w:pBdr>
+                <w:top w:val="nil"/>
+                <w:left w:val="nil"/>
+                <w:bottom w:val="nil"/>
+                <w:right w:val="nil"/>
+                <w:between w:val="nil"/>
+              </w:pBdr>
+              <w:spacing w:before="60" w:after="60"/>
+              <w:jc w:val="center"/>
+              <w:rPr>
+                <w:rFonts w:ascii="Arial" w:eastAsia="Arial" w:hAnsi="Arial" w:cs="Arial"/>
+                <w:color w:val="021A32"/>
+                <w:sz w:val="26"/>
+                <w:szCs w:val="26"/>
+                <w:lang w:val="en-GB"/>
+              </w:rPr>
+            </w:pPr>
+            <w:r>
+              <w:rPr>
+                <w:rFonts w:ascii="Arial" w:eastAsia="Arial" w:hAnsi="Arial" w:cs="Arial"/>
+                <w:color w:val="021A32"/>
+                <w:sz w:val="26"/>
+                <w:szCs w:val="26"/>
+                <w:lang w:val="en-GB"/>
+              </w:rPr>
+              <w:t>{%</w:t>
+            </w:r>
+            <w:proofErr w:type="spellStart"/>
+            <w:r>
+              <w:rPr>
+                <w:rFonts w:ascii="Arial" w:eastAsia="Arial" w:hAnsi="Arial" w:cs="Arial"/>
+                <w:color w:val="021A32"/>
+                <w:sz w:val="26"/>
+                <w:szCs w:val="26"/>
+                <w:lang w:val="en-GB"/>
+              </w:rPr>
+              <w:t>tr</w:t>
+            </w:r>
+            <w:proofErr w:type="spellEnd"/>
+            <w:r>
+              <w:rPr>
+                <w:rFonts w:ascii="Arial" w:eastAsia="Arial" w:hAnsi="Arial" w:cs="Arial"/>
+                <w:color w:val="021A32"/>
+                <w:sz w:val="26"/>
+                <w:szCs w:val="26"/>
+                <w:lang w:val="en-GB"/>
+              </w:rPr>
+              <w:t xml:space="preserve"> for us in </w:t>
+            </w:r>
+            <w:proofErr w:type="spellStart"/>
+            <w:r>
+              <w:rPr>
+                <w:rFonts w:ascii="Arial" w:eastAsia="Arial" w:hAnsi="Arial" w:cs="Arial"/>
+                <w:color w:val="021A32"/>
+                <w:sz w:val="26"/>
+                <w:szCs w:val="26"/>
+                <w:lang w:val="en-GB"/>
+              </w:rPr>
+              <w:t>phase.us_set.all</w:t>
+            </w:r>
+            <w:proofErr w:type="spellEnd"/>
+            <w:r>
+              <w:rPr>
+                <w:rFonts w:ascii="Arial" w:eastAsia="Arial" w:hAnsi="Arial" w:cs="Arial"/>
+                <w:color w:val="021A32"/>
+                <w:sz w:val="26"/>
+                <w:szCs w:val="26"/>
+                <w:lang w:val="en-GB"/>
+              </w:rPr>
+              <w:t>() %}</w:t>
+            </w:r>
+          </w:p>
+        </w:tc>
+      </w:tr>
+      <w:tr>
+        <w:tc>
+          <w:tcPr>
+            <w:tcW w:w="2674" w:type="dxa"/>
+            <w:shd w:val="clear" w:color="auto" w:fill="auto"/>
+            <w:vAlign w:val="center"/>
+          </w:tcPr>
+          <w:p>
+            <w:pPr>
+              <w:pBdr>
+                <w:top w:val="nil"/>
+                <w:left w:val="nil"/>
+                <w:bottom w:val="nil"/>
+                <w:right w:val="nil"/>
+                <w:between w:val="nil"/>
+              </w:pBdr>
+              <w:spacing w:before="60" w:after="60"/>
+              <w:jc w:val="center"/>
+              <w:rPr>
+                <w:rFonts w:ascii="Arial" w:eastAsia="Arial" w:hAnsi="Arial" w:cs="Arial"/>
+                <w:color w:val="021A32"/>
+                <w:sz w:val="26"/>
+                <w:szCs w:val="26"/>
+                <w:lang w:val="en-GB"/>
+              </w:rPr>
+            </w:pPr>
+            <w:proofErr w:type="spellStart"/>
+            <w:r>
+              <w:rPr>
+                <w:rFonts w:ascii="Arial" w:eastAsia="Arial" w:hAnsi="Arial" w:cs="Arial"/>
+                <w:color w:val="021A32"/>
+                <w:sz w:val="26"/>
+                <w:szCs w:val="26"/>
+                <w:lang w:val="en-GB"/>
+              </w:rPr>
+              <w:t>Fonctionalité</w:t>
+            </w:r>
+            <w:proofErr w:type="spellEnd"/>
+            <w:r>
+              <w:rPr>
+                <w:rFonts w:ascii="Arial" w:eastAsia="Arial" w:hAnsi="Arial" w:cs="Arial"/>
+                <w:color w:val="021A32"/>
+                <w:sz w:val="26"/>
+                <w:szCs w:val="26"/>
+                <w:lang w:val="en-GB"/>
+              </w:rPr>
+              <w:t xml:space="preserve"> :</w:t>
+            </w:r>
+          </w:p>
+        </w:tc>
+        <w:tc>
+          <w:tcPr>
+            <w:tcW w:w="6789" w:type="dxa"/>
+            <w:gridSpan w:val="4"/>
+            <w:shd w:val="clear" w:color="auto" w:fill="auto"/>
+            <w:vAlign w:val="center"/>
+          </w:tcPr>
+          <w:p>
+            <w:pPr>
+              <w:pBdr>
+                <w:top w:val="nil"/>
+                <w:left w:val="nil"/>
+                <w:bottom w:val="nil"/>
+                <w:right w:val="nil"/>
+                <w:between w:val="nil"/>
+              </w:pBdr>
+              <w:spacing w:before="60" w:after="60"/>
+              <w:jc w:val="center"/>
+              <w:rPr>
+                <w:rFonts w:ascii="Arial" w:eastAsia="Arial" w:hAnsi="Arial" w:cs="Arial"/>
+                <w:color w:val="021A32"/>
+                <w:sz w:val="26"/>
+                <w:szCs w:val="26"/>
+                <w:lang w:val="en-GB"/>
+              </w:rPr>
+            </w:pPr>
+            <w:r>
+              <w:rPr>
+                <w:rFonts w:ascii="Arial" w:eastAsia="Arial" w:hAnsi="Arial" w:cs="Arial"/>
+                <w:color w:val="021A32"/>
+                <w:sz w:val="26"/>
+                <w:szCs w:val="26"/>
+                <w:lang w:val="en-GB"/>
+              </w:rPr>
+              <w:t>{{ us.name }}</w:t>
+            </w:r>
+          </w:p>
+        </w:tc>
+      </w:tr>
+      <w:tr>
+        <w:tc>
+          <w:tcPr>
+            <w:tcW w:w="9463" w:type="dxa"/>
+            <w:gridSpan w:val="5"/>
+            <w:shd w:val="clear" w:color="auto" w:fill="auto"/>
+            <w:vAlign w:val="center"/>
+          </w:tcPr>
+          <w:p>
+            <w:pPr>
+              <w:pBdr>
+                <w:top w:val="nil"/>
+                <w:left w:val="nil"/>
+                <w:bottom w:val="nil"/>
+                <w:right w:val="nil"/>
+                <w:between w:val="nil"/>
+              </w:pBdr>
+              <w:spacing w:before="60" w:after="60"/>
+              <w:jc w:val="center"/>
+              <w:rPr>
+                <w:rFonts w:ascii="Arial" w:eastAsia="Arial" w:hAnsi="Arial" w:cs="Arial"/>
+                <w:color w:val="021A32"/>
+                <w:sz w:val="26"/>
+                <w:szCs w:val="26"/>
+              </w:rPr>
+            </w:pPr>
+            <w:bookmarkStart w:id="1" w:name="_GoBack"/>
+            <w:bookmarkEnd w:id="1"/>
+            <w:r>
+              <w:rPr>
+                <w:rFonts w:ascii="Arial" w:eastAsia="Arial" w:hAnsi="Arial" w:cs="Arial"/>
+                <w:color w:val="021A32"/>
+                <w:sz w:val="26"/>
+                <w:szCs w:val="26"/>
+              </w:rPr>
+              <w:t xml:space="preserve">{%tr </w:t>
+            </w:r>
+            <w:proofErr w:type="spellStart"/>
+            <w:r>
+              <w:rPr>
+                <w:rFonts w:ascii="Arial" w:eastAsia="Arial" w:hAnsi="Arial" w:cs="Arial"/>
+                <w:color w:val="021A32"/>
+                <w:sz w:val="26"/>
+                <w:szCs w:val="26"/>
+              </w:rPr>
+              <w:t>endfor</w:t>
+            </w:r>
+            <w:proofErr w:type="spellEnd"/>
+            <w:r>
+              <w:rPr>
+                <w:rFonts w:ascii="Arial" w:eastAsia="Arial" w:hAnsi="Arial" w:cs="Arial"/>
+                <w:color w:val="021A32"/>
+                <w:sz w:val="26"/>
+                <w:szCs w:val="26"/>
+              </w:rPr>
+              <w:t xml:space="preserve"> %}</w:t>
+            </w:r>
+          </w:p>
+        </w:tc>
+      </w:tr>
+      <w:tr>
+        <w:tc>
+          <w:tcPr>
             <w:tcW w:w="3409" w:type="dxa"/>
+            <w:gridSpan w:val="2"/>
             <w:shd w:val="clear" w:color="auto" w:fill="auto"/>
             <w:vAlign w:val="center"/>
           </w:tcPr>
@@ -1904,7 +2177,6 @@
                 <w:color w:val="021A32"/>
                 <w:sz w:val="26"/>
                 <w:szCs w:val="26"/>
-                <w:lang w:val="en-GB"/>
               </w:rPr>
             </w:pPr>
             <w:r>
@@ -1914,7 +2186,6 @@
                 <w:color w:val="021A32"/>
                 <w:sz w:val="26"/>
                 <w:szCs w:val="26"/>
-                <w:lang w:val="en-GB"/>
               </w:rPr>
               <w:t xml:space="preserve">{%if </w:t>
             </w:r>
@@ -1926,7 +2197,6 @@
                 <w:color w:val="021A32"/>
                 <w:sz w:val="26"/>
                 <w:szCs w:val="26"/>
-                <w:lang w:val="en-GB"/>
               </w:rPr>
               <w:t>loop.last</w:t>
             </w:r>
@@ -1938,7 +2208,6 @@
                 <w:color w:val="021A32"/>
                 <w:sz w:val="26"/>
                 <w:szCs w:val="26"/>
-                <w:lang w:val="en-GB"/>
               </w:rPr>
               <w:t xml:space="preserve"> %}Total phase </w:t>
             </w:r>
@@ -2196,7 +2465,7 @@
         <w:tc>
           <w:tcPr>
             <w:tcW w:w="9463" w:type="dxa"/>
-            <w:gridSpan w:val="4"/>
+            <w:gridSpan w:val="5"/>
             <w:shd w:val="clear" w:color="auto" w:fill="8F8F8F"/>
           </w:tcPr>
           <w:p>
@@ -3513,8 +3782,6 @@
                 <w:szCs w:val="20"/>
               </w:rPr>
             </w:pPr>
-            <w:bookmarkStart w:id="1" w:name="_GoBack"/>
-            <w:bookmarkEnd w:id="1"/>
           </w:p>
           <w:p>
             <w:pPr>
@@ -4771,7 +5038,6 @@
         <w:sz w:val="16"/>
         <w:szCs w:val="16"/>
         <w:highlight w:val="lightGray"/>
-        <w:lang w:val="en-GB"/>
       </w:rPr>
     </w:pPr>
     <w:r>
@@ -4780,7 +5046,6 @@
         <w:color w:val="000000"/>
         <w:sz w:val="16"/>
         <w:szCs w:val="16"/>
-        <w:lang w:val="en-GB"/>
       </w:rPr>
       <w:t>{</w:t>
     </w:r>
@@ -4791,7 +5056,6 @@
         <w:color w:val="000000"/>
         <w:sz w:val="16"/>
         <w:szCs w:val="16"/>
-        <w:lang w:val="en-GB"/>
       </w:rPr>
       <w:t xml:space="preserve">{ </w:t>
     </w:r>
@@ -4802,7 +5066,6 @@
         <w:color w:val="000000"/>
         <w:sz w:val="16"/>
         <w:szCs w:val="16"/>
-        <w:lang w:val="en-GB"/>
       </w:rPr>
       <w:t>param</w:t>
     </w:r>
@@ -4814,7 +5077,6 @@
         <w:color w:val="000000"/>
         <w:sz w:val="16"/>
         <w:szCs w:val="16"/>
-        <w:lang w:val="en-GB"/>
       </w:rPr>
       <w:t>(</w:t>
     </w:r>
@@ -4824,7 +5086,6 @@
         <w:color w:val="000000"/>
         <w:sz w:val="16"/>
         <w:szCs w:val="20"/>
-        <w:lang w:val="en-GB"/>
       </w:rPr>
       <w:t>'</w:t>
     </w:r>
@@ -4835,7 +5096,6 @@
         <w:color w:val="000000"/>
         <w:sz w:val="16"/>
         <w:szCs w:val="20"/>
-        <w:lang w:val="en-GB"/>
       </w:rPr>
       <w:t>je_address</w:t>
     </w:r>
@@ -4846,7 +5106,6 @@
         <w:color w:val="000000"/>
         <w:sz w:val="16"/>
         <w:szCs w:val="20"/>
-        <w:lang w:val="en-GB"/>
       </w:rPr>
       <w:t>'</w:t>
     </w:r>
@@ -4856,49 +5115,26 @@
         <w:color w:val="000000"/>
         <w:sz w:val="16"/>
         <w:szCs w:val="16"/>
-        <w:lang w:val="en-GB"/>
-      </w:rPr>
-      <w:t xml:space="preserve">) }} </w:t>
-    </w:r>
+      </w:rPr>
+      <w:t>) }} – 02.23.23.85.72 – {</w:t>
+    </w:r>
+    <w:proofErr w:type="gramStart"/>
     <w:r>
       <w:rPr>
         <w:rFonts w:ascii="Arial" w:eastAsia="Arial" w:hAnsi="Arial" w:cs="Arial"/>
         <w:color w:val="000000"/>
         <w:sz w:val="16"/>
         <w:szCs w:val="16"/>
-        <w:lang w:val="en-GB"/>
-      </w:rPr>
-      <w:t xml:space="preserve">– 02.23.23.85.72 – </w:t>
-    </w:r>
+      </w:rPr>
+      <w:t xml:space="preserve">{ </w:t>
+    </w:r>
+    <w:proofErr w:type="spellStart"/>
     <w:r>
       <w:rPr>
         <w:rFonts w:ascii="Arial" w:eastAsia="Arial" w:hAnsi="Arial" w:cs="Arial"/>
         <w:color w:val="000000"/>
         <w:sz w:val="16"/>
         <w:szCs w:val="16"/>
-        <w:lang w:val="en-GB"/>
-      </w:rPr>
-      <w:t>{</w:t>
-    </w:r>
-    <w:proofErr w:type="gramStart"/>
-    <w:r>
-      <w:rPr>
-        <w:rFonts w:ascii="Arial" w:eastAsia="Arial" w:hAnsi="Arial" w:cs="Arial"/>
-        <w:color w:val="000000"/>
-        <w:sz w:val="16"/>
-        <w:szCs w:val="16"/>
-        <w:lang w:val="en-GB"/>
-      </w:rPr>
-      <w:t xml:space="preserve">{ </w:t>
-    </w:r>
-    <w:proofErr w:type="spellStart"/>
-    <w:r>
-      <w:rPr>
-        <w:rFonts w:ascii="Arial" w:eastAsia="Arial" w:hAnsi="Arial" w:cs="Arial"/>
-        <w:color w:val="000000"/>
-        <w:sz w:val="16"/>
-        <w:szCs w:val="16"/>
-        <w:lang w:val="en-GB"/>
       </w:rPr>
       <w:t>param</w:t>
     </w:r>
@@ -4910,7 +5146,6 @@
         <w:color w:val="000000"/>
         <w:sz w:val="16"/>
         <w:szCs w:val="16"/>
-        <w:lang w:val="en-GB"/>
       </w:rPr>
       <w:t>(</w:t>
     </w:r>
@@ -4920,7 +5155,6 @@
         <w:color w:val="000000"/>
         <w:sz w:val="16"/>
         <w:szCs w:val="20"/>
-        <w:lang w:val="en-GB"/>
       </w:rPr>
       <w:t>'</w:t>
     </w:r>
@@ -4931,7 +5165,6 @@
         <w:color w:val="000000"/>
         <w:sz w:val="16"/>
         <w:szCs w:val="20"/>
-        <w:lang w:val="en-GB"/>
       </w:rPr>
       <w:t>je_contact</w:t>
     </w:r>
@@ -4942,7 +5175,6 @@
         <w:color w:val="000000"/>
         <w:sz w:val="16"/>
         <w:szCs w:val="20"/>
-        <w:lang w:val="en-GB"/>
       </w:rPr>
       <w:t>'</w:t>
     </w:r>
@@ -4952,7 +5184,6 @@
         <w:color w:val="000000"/>
         <w:sz w:val="16"/>
         <w:szCs w:val="16"/>
-        <w:lang w:val="en-GB"/>
       </w:rPr>
       <w:t>) }}</w:t>
     </w:r>

</xml_diff>

<commit_message>
Fixed an issue with DEVIS generation
</commit_message>
<xml_diff>
--- a/flower_backend/doctypes/DEVIS.docx
+++ b/flower_backend/doctypes/DEVIS.docx
@@ -125,7 +125,19 @@
           <w:sz w:val="22"/>
           <w:szCs w:val="22"/>
         </w:rPr>
-        <w:t>A l'attention de :</w:t>
+        <w:t>À</w:t>
+      </w:r>
+      <w:bookmarkStart w:id="0" w:name="_GoBack"/>
+      <w:bookmarkEnd w:id="0"/>
+      <w:r>
+        <w:rPr>
+          <w:rFonts w:ascii="Arial" w:eastAsia="Arial" w:hAnsi="Arial" w:cs="Arial"/>
+          <w:b/>
+          <w:color w:val="000000"/>
+          <w:sz w:val="22"/>
+          <w:szCs w:val="22"/>
+        </w:rPr>
+        <w:t xml:space="preserve"> l'attention de :</w:t>
       </w:r>
       <w:r>
         <w:rPr>
@@ -515,46 +527,6 @@
     </w:p>
     <w:p>
       <w:pPr>
-        <w:rPr>
-          <w:rFonts w:ascii="Arial" w:eastAsia="Arial" w:hAnsi="Arial" w:cs="Arial"/>
-          <w:color w:val="021A32"/>
-          <w:sz w:val="22"/>
-          <w:szCs w:val="22"/>
-        </w:rPr>
-      </w:pPr>
-    </w:p>
-    <w:p>
-      <w:pPr>
-        <w:rPr>
-          <w:rFonts w:ascii="Arial" w:eastAsia="Arial" w:hAnsi="Arial" w:cs="Arial"/>
-          <w:color w:val="021A32"/>
-          <w:sz w:val="22"/>
-          <w:szCs w:val="22"/>
-        </w:rPr>
-      </w:pPr>
-    </w:p>
-    <w:p>
-      <w:pPr>
-        <w:rPr>
-          <w:rFonts w:ascii="Arial" w:eastAsia="Arial" w:hAnsi="Arial" w:cs="Arial"/>
-          <w:color w:val="021A32"/>
-          <w:sz w:val="22"/>
-          <w:szCs w:val="22"/>
-        </w:rPr>
-      </w:pPr>
-    </w:p>
-    <w:p>
-      <w:pPr>
-        <w:rPr>
-          <w:rFonts w:ascii="Arial" w:eastAsia="Arial" w:hAnsi="Arial" w:cs="Arial"/>
-          <w:color w:val="021A32"/>
-          <w:sz w:val="22"/>
-          <w:szCs w:val="22"/>
-        </w:rPr>
-      </w:pPr>
-    </w:p>
-    <w:p>
-      <w:pPr>
         <w:jc w:val="right"/>
         <w:rPr>
           <w:rFonts w:ascii="Arial" w:eastAsia="Arial" w:hAnsi="Arial" w:cs="Arial"/>
@@ -728,7 +700,6 @@
           <w:szCs w:val="22"/>
         </w:rPr>
       </w:pPr>
-      <w:bookmarkStart w:id="0" w:name="_GoBack"/>
       <w:r>
         <w:rPr>
           <w:rFonts w:ascii="Arial" w:eastAsia="Helvetica Neue" w:hAnsi="Arial" w:cs="Arial"/>
@@ -761,7 +732,7 @@
           <w:sz w:val="22"/>
           <w:szCs w:val="22"/>
         </w:rPr>
-        <w:t>etude.group</w:t>
+        <w:t>etude.</w:t>
       </w:r>
       <w:r>
         <w:rPr>
@@ -769,7 +740,15 @@
           <w:sz w:val="22"/>
           <w:szCs w:val="22"/>
         </w:rPr>
-        <w:t>e</w:t>
+        <w:t>currentGroupes</w:t>
+      </w:r>
+      <w:r>
+        <w:rPr>
+          <w:rFonts w:ascii="Arial" w:eastAsia="Helvetica Neue" w:hAnsi="Arial" w:cs="Arial"/>
+          <w:sz w:val="22"/>
+          <w:szCs w:val="22"/>
+        </w:rPr>
+        <w:t>.groupe</w:t>
       </w:r>
       <w:proofErr w:type="gramEnd"/>
       <w:r>
@@ -848,7 +827,6 @@
           <w:b/>
           <w:sz w:val="22"/>
           <w:szCs w:val="22"/>
-          <w:lang w:val="en-GB"/>
         </w:rPr>
       </w:pPr>
       <w:r>
@@ -857,19 +835,18 @@
           <w:b/>
           <w:sz w:val="22"/>
           <w:szCs w:val="22"/>
-          <w:lang w:val="en-GB"/>
-        </w:rPr>
-        <w:t>{%for groupe in etude.groupe</w:t>
-      </w:r>
+        </w:rPr>
+        <w:t xml:space="preserve">{%for groupe in </w:t>
+      </w:r>
+      <w:proofErr w:type="spellStart"/>
       <w:r>
         <w:rPr>
           <w:rFonts w:ascii="Arial" w:eastAsia="Arial" w:hAnsi="Arial" w:cs="Arial"/>
           <w:b/>
           <w:sz w:val="22"/>
           <w:szCs w:val="22"/>
-          <w:lang w:val="en-GB"/>
-        </w:rPr>
-        <w:t>_</w:t>
+        </w:rPr>
+        <w:t>etude.</w:t>
       </w:r>
       <w:r>
         <w:rPr>
@@ -877,9 +854,8 @@
           <w:b/>
           <w:sz w:val="22"/>
           <w:szCs w:val="22"/>
-          <w:lang w:val="en-GB"/>
-        </w:rPr>
-        <w:t>s</w:t>
+        </w:rPr>
+        <w:t>currentGroupes</w:t>
       </w:r>
       <w:r>
         <w:rPr>
@@ -887,39 +863,56 @@
           <w:b/>
           <w:sz w:val="22"/>
           <w:szCs w:val="22"/>
-          <w:lang w:val="en-GB"/>
-        </w:rPr>
-        <w:t>et.</w:t>
-      </w:r>
+        </w:rPr>
+        <w:t>.groupe_</w:t>
+      </w:r>
+      <w:proofErr w:type="gramStart"/>
       <w:r>
         <w:rPr>
           <w:rFonts w:ascii="Arial" w:eastAsia="Arial" w:hAnsi="Arial" w:cs="Arial"/>
           <w:b/>
           <w:sz w:val="22"/>
           <w:szCs w:val="22"/>
-          <w:lang w:val="en-GB"/>
+        </w:rPr>
+        <w:t>set</w:t>
+      </w:r>
+      <w:r>
+        <w:rPr>
+          <w:rFonts w:ascii="Arial" w:eastAsia="Arial" w:hAnsi="Arial" w:cs="Arial"/>
+          <w:b/>
+          <w:sz w:val="22"/>
+          <w:szCs w:val="22"/>
+        </w:rPr>
+        <w:t>.</w:t>
+      </w:r>
+      <w:r>
+        <w:rPr>
+          <w:rFonts w:ascii="Arial" w:eastAsia="Arial" w:hAnsi="Arial" w:cs="Arial"/>
+          <w:b/>
+          <w:sz w:val="22"/>
+          <w:szCs w:val="22"/>
         </w:rPr>
         <w:t>iterator</w:t>
       </w:r>
+      <w:proofErr w:type="spellEnd"/>
       <w:r>
         <w:rPr>
           <w:rFonts w:ascii="Arial" w:eastAsia="Arial" w:hAnsi="Arial" w:cs="Arial"/>
           <w:b/>
           <w:sz w:val="22"/>
           <w:szCs w:val="22"/>
-          <w:lang w:val="en-GB"/>
-        </w:rPr>
-        <w:t>()</w:t>
-      </w:r>
+        </w:rPr>
+        <w:t>(</w:t>
+      </w:r>
+      <w:proofErr w:type="gramEnd"/>
       <w:r>
         <w:rPr>
           <w:rFonts w:ascii="Arial" w:eastAsia="Arial" w:hAnsi="Arial" w:cs="Arial"/>
           <w:b/>
           <w:sz w:val="22"/>
           <w:szCs w:val="22"/>
-          <w:lang w:val="en-GB"/>
-        </w:rPr>
-        <w:t xml:space="preserve"> | sort(attribute=’index’)</w:t>
+        </w:rPr>
+        <w:t>)</w:t>
       </w:r>
       <w:r>
         <w:rPr>
@@ -927,17 +920,84 @@
           <w:b/>
           <w:sz w:val="22"/>
           <w:szCs w:val="22"/>
-          <w:lang w:val="en-GB"/>
-        </w:rPr>
-        <w:t xml:space="preserve"> %}Phase {{loop.index}} : {{ groupe.ti</w:t>
-      </w:r>
+        </w:rPr>
+        <w:t xml:space="preserve"> | sort(</w:t>
+      </w:r>
+      <w:proofErr w:type="spellStart"/>
       <w:r>
         <w:rPr>
           <w:rFonts w:ascii="Arial" w:eastAsia="Arial" w:hAnsi="Arial" w:cs="Arial"/>
           <w:b/>
           <w:sz w:val="22"/>
           <w:szCs w:val="22"/>
-          <w:lang w:val="en-GB"/>
+        </w:rPr>
+        <w:t>attribute</w:t>
+      </w:r>
+      <w:proofErr w:type="spellEnd"/>
+      <w:r>
+        <w:rPr>
+          <w:rFonts w:ascii="Arial" w:eastAsia="Arial" w:hAnsi="Arial" w:cs="Arial"/>
+          <w:b/>
+          <w:sz w:val="22"/>
+          <w:szCs w:val="22"/>
+        </w:rPr>
+        <w:t>=’index’)</w:t>
+      </w:r>
+      <w:r>
+        <w:rPr>
+          <w:rFonts w:ascii="Arial" w:eastAsia="Arial" w:hAnsi="Arial" w:cs="Arial"/>
+          <w:b/>
+          <w:sz w:val="22"/>
+          <w:szCs w:val="22"/>
+        </w:rPr>
+        <w:t xml:space="preserve"> %}Phase {{</w:t>
+      </w:r>
+      <w:proofErr w:type="spellStart"/>
+      <w:r>
+        <w:rPr>
+          <w:rFonts w:ascii="Arial" w:eastAsia="Arial" w:hAnsi="Arial" w:cs="Arial"/>
+          <w:b/>
+          <w:sz w:val="22"/>
+          <w:szCs w:val="22"/>
+        </w:rPr>
+        <w:t>loop.index</w:t>
+      </w:r>
+      <w:proofErr w:type="spellEnd"/>
+      <w:r>
+        <w:rPr>
+          <w:rFonts w:ascii="Arial" w:eastAsia="Arial" w:hAnsi="Arial" w:cs="Arial"/>
+          <w:b/>
+          <w:sz w:val="22"/>
+          <w:szCs w:val="22"/>
+        </w:rPr>
+        <w:t>}} : {</w:t>
+      </w:r>
+      <w:proofErr w:type="gramStart"/>
+      <w:r>
+        <w:rPr>
+          <w:rFonts w:ascii="Arial" w:eastAsia="Arial" w:hAnsi="Arial" w:cs="Arial"/>
+          <w:b/>
+          <w:sz w:val="22"/>
+          <w:szCs w:val="22"/>
+        </w:rPr>
+        <w:t xml:space="preserve">{ </w:t>
+      </w:r>
+      <w:proofErr w:type="spellStart"/>
+      <w:r>
+        <w:rPr>
+          <w:rFonts w:ascii="Arial" w:eastAsia="Arial" w:hAnsi="Arial" w:cs="Arial"/>
+          <w:b/>
+          <w:sz w:val="22"/>
+          <w:szCs w:val="22"/>
+        </w:rPr>
+        <w:t>groupe.ti</w:t>
+      </w:r>
+      <w:r>
+        <w:rPr>
+          <w:rFonts w:ascii="Arial" w:eastAsia="Arial" w:hAnsi="Arial" w:cs="Arial"/>
+          <w:b/>
+          <w:sz w:val="22"/>
+          <w:szCs w:val="22"/>
         </w:rPr>
         <w:t>tl</w:t>
       </w:r>
@@ -947,9 +1007,19 @@
           <w:b/>
           <w:sz w:val="22"/>
           <w:szCs w:val="22"/>
-          <w:lang w:val="en-GB"/>
-        </w:rPr>
-        <w:t>e }}</w:t>
+        </w:rPr>
+        <w:t>e</w:t>
+      </w:r>
+      <w:proofErr w:type="spellEnd"/>
+      <w:proofErr w:type="gramEnd"/>
+      <w:r>
+        <w:rPr>
+          <w:rFonts w:ascii="Arial" w:eastAsia="Arial" w:hAnsi="Arial" w:cs="Arial"/>
+          <w:b/>
+          <w:sz w:val="22"/>
+          <w:szCs w:val="22"/>
+        </w:rPr>
+        <w:t xml:space="preserve"> }}</w:t>
       </w:r>
     </w:p>
     <w:p>
@@ -959,7 +1029,6 @@
           <w:b/>
           <w:sz w:val="22"/>
           <w:szCs w:val="22"/>
-          <w:lang w:val="en-GB"/>
         </w:rPr>
       </w:pPr>
     </w:p>
@@ -1232,7 +1301,6 @@
         <w:t>%}</w:t>
       </w:r>
     </w:p>
-    <w:bookmarkEnd w:id="0"/>
     <w:p>
       <w:pPr>
         <w:rPr>
@@ -1428,7 +1496,6 @@
                 <w:b/>
                 <w:sz w:val="22"/>
                 <w:szCs w:val="22"/>
-                <w:lang w:val="en-GB"/>
               </w:rPr>
             </w:pPr>
             <w:r>
@@ -1438,7 +1505,6 @@
                 <w:color w:val="FFFFFF"/>
                 <w:sz w:val="26"/>
                 <w:szCs w:val="26"/>
-                <w:lang w:val="en-GB"/>
               </w:rPr>
               <w:t>{%</w:t>
             </w:r>
@@ -1449,7 +1515,6 @@
                 <w:color w:val="FFFFFF"/>
                 <w:sz w:val="26"/>
                 <w:szCs w:val="26"/>
-                <w:lang w:val="en-GB"/>
               </w:rPr>
               <w:t xml:space="preserve"> </w:t>
             </w:r>
@@ -1460,73 +1525,186 @@
                 <w:color w:val="FFFFFF"/>
                 <w:sz w:val="26"/>
                 <w:szCs w:val="26"/>
-                <w:lang w:val="en-GB"/>
-              </w:rPr>
-              <w:t>for groupe in etude.groupe</w:t>
-            </w:r>
-            <w:r>
-              <w:rPr>
-                <w:rFonts w:ascii="Arial" w:eastAsia="Arial" w:hAnsi="Arial" w:cs="Arial"/>
-                <w:b/>
-                <w:color w:val="FFFFFF"/>
-                <w:sz w:val="26"/>
-                <w:szCs w:val="26"/>
-                <w:lang w:val="en-GB"/>
-              </w:rPr>
-              <w:t>_set.iterator()</w:t>
-            </w:r>
-            <w:r>
-              <w:rPr>
-                <w:rFonts w:ascii="Arial" w:eastAsia="Arial" w:hAnsi="Arial" w:cs="Arial"/>
-                <w:b/>
-                <w:color w:val="FFFFFF"/>
-                <w:sz w:val="26"/>
-                <w:szCs w:val="26"/>
-                <w:lang w:val="en-GB"/>
-              </w:rPr>
-              <w:t xml:space="preserve"> | sort(attribute=’index’)</w:t>
-            </w:r>
-            <w:r>
-              <w:rPr>
-                <w:rFonts w:ascii="Arial" w:eastAsia="Arial" w:hAnsi="Arial" w:cs="Arial"/>
-                <w:b/>
-                <w:color w:val="FFFFFF"/>
-                <w:sz w:val="26"/>
-                <w:szCs w:val="26"/>
-                <w:lang w:val="en-GB"/>
-              </w:rPr>
-              <w:t xml:space="preserve"> %} Phase {{</w:t>
-            </w:r>
-            <w:r>
-              <w:rPr>
-                <w:rFonts w:ascii="Arial" w:eastAsia="Arial" w:hAnsi="Arial" w:cs="Arial"/>
-                <w:b/>
-                <w:color w:val="FFFFFF"/>
-                <w:sz w:val="26"/>
-                <w:szCs w:val="26"/>
-                <w:lang w:val="en-GB"/>
+              </w:rPr>
+              <w:t xml:space="preserve">for groupe in </w:t>
+            </w:r>
+            <w:proofErr w:type="spellStart"/>
+            <w:r>
+              <w:rPr>
+                <w:rFonts w:ascii="Arial" w:eastAsia="Arial" w:hAnsi="Arial" w:cs="Arial"/>
+                <w:b/>
+                <w:color w:val="FFFFFF"/>
+                <w:sz w:val="26"/>
+                <w:szCs w:val="26"/>
+              </w:rPr>
+              <w:t>etude.currentGroupes</w:t>
+            </w:r>
+            <w:r>
+              <w:rPr>
+                <w:rFonts w:ascii="Arial" w:eastAsia="Arial" w:hAnsi="Arial" w:cs="Arial"/>
+                <w:b/>
+                <w:color w:val="FFFFFF"/>
+                <w:sz w:val="26"/>
+                <w:szCs w:val="26"/>
+              </w:rPr>
+              <w:t>.group</w:t>
+            </w:r>
+            <w:r>
+              <w:rPr>
+                <w:rFonts w:ascii="Arial" w:eastAsia="Arial" w:hAnsi="Arial" w:cs="Arial"/>
+                <w:b/>
+                <w:color w:val="FFFFFF"/>
+                <w:sz w:val="26"/>
+                <w:szCs w:val="26"/>
+              </w:rPr>
+              <w:t>e</w:t>
+            </w:r>
+            <w:r>
+              <w:rPr>
+                <w:rFonts w:ascii="Arial" w:eastAsia="Arial" w:hAnsi="Arial" w:cs="Arial"/>
+                <w:b/>
+                <w:color w:val="FFFFFF"/>
+                <w:sz w:val="26"/>
+                <w:szCs w:val="26"/>
+              </w:rPr>
+              <w:t>_</w:t>
+            </w:r>
+            <w:proofErr w:type="gramStart"/>
+            <w:r>
+              <w:rPr>
+                <w:rFonts w:ascii="Arial" w:eastAsia="Arial" w:hAnsi="Arial" w:cs="Arial"/>
+                <w:b/>
+                <w:color w:val="FFFFFF"/>
+                <w:sz w:val="26"/>
+                <w:szCs w:val="26"/>
+              </w:rPr>
+              <w:t>s</w:t>
+            </w:r>
+            <w:r>
+              <w:rPr>
+                <w:rFonts w:ascii="Arial" w:eastAsia="Arial" w:hAnsi="Arial" w:cs="Arial"/>
+                <w:b/>
+                <w:color w:val="FFFFFF"/>
+                <w:sz w:val="26"/>
+                <w:szCs w:val="26"/>
+              </w:rPr>
+              <w:t>et</w:t>
+            </w:r>
+            <w:r>
+              <w:rPr>
+                <w:rFonts w:ascii="Arial" w:eastAsia="Arial" w:hAnsi="Arial" w:cs="Arial"/>
+                <w:b/>
+                <w:color w:val="FFFFFF"/>
+                <w:sz w:val="26"/>
+                <w:szCs w:val="26"/>
+              </w:rPr>
+              <w:t>.iterator</w:t>
+            </w:r>
+            <w:proofErr w:type="spellEnd"/>
+            <w:r>
+              <w:rPr>
+                <w:rFonts w:ascii="Arial" w:eastAsia="Arial" w:hAnsi="Arial" w:cs="Arial"/>
+                <w:b/>
+                <w:color w:val="FFFFFF"/>
+                <w:sz w:val="26"/>
+                <w:szCs w:val="26"/>
+              </w:rPr>
+              <w:t>(</w:t>
+            </w:r>
+            <w:proofErr w:type="gramEnd"/>
+            <w:r>
+              <w:rPr>
+                <w:rFonts w:ascii="Arial" w:eastAsia="Arial" w:hAnsi="Arial" w:cs="Arial"/>
+                <w:b/>
+                <w:color w:val="FFFFFF"/>
+                <w:sz w:val="26"/>
+                <w:szCs w:val="26"/>
+              </w:rPr>
+              <w:t>)</w:t>
+            </w:r>
+            <w:r>
+              <w:rPr>
+                <w:rFonts w:ascii="Arial" w:eastAsia="Arial" w:hAnsi="Arial" w:cs="Arial"/>
+                <w:b/>
+                <w:color w:val="FFFFFF"/>
+                <w:sz w:val="26"/>
+                <w:szCs w:val="26"/>
+              </w:rPr>
+              <w:t xml:space="preserve"> | sort(</w:t>
+            </w:r>
+            <w:proofErr w:type="spellStart"/>
+            <w:r>
+              <w:rPr>
+                <w:rFonts w:ascii="Arial" w:eastAsia="Arial" w:hAnsi="Arial" w:cs="Arial"/>
+                <w:b/>
+                <w:color w:val="FFFFFF"/>
+                <w:sz w:val="26"/>
+                <w:szCs w:val="26"/>
+              </w:rPr>
+              <w:t>attribute</w:t>
+            </w:r>
+            <w:proofErr w:type="spellEnd"/>
+            <w:r>
+              <w:rPr>
+                <w:rFonts w:ascii="Arial" w:eastAsia="Arial" w:hAnsi="Arial" w:cs="Arial"/>
+                <w:b/>
+                <w:color w:val="FFFFFF"/>
+                <w:sz w:val="26"/>
+                <w:szCs w:val="26"/>
+              </w:rPr>
+              <w:t>=’index’)</w:t>
+            </w:r>
+            <w:r>
+              <w:rPr>
+                <w:rFonts w:ascii="Arial" w:eastAsia="Arial" w:hAnsi="Arial" w:cs="Arial"/>
+                <w:b/>
+                <w:color w:val="FFFFFF"/>
+                <w:sz w:val="26"/>
+                <w:szCs w:val="26"/>
+              </w:rPr>
+              <w:t xml:space="preserve"> %} Phase {</w:t>
+            </w:r>
+            <w:proofErr w:type="gramStart"/>
+            <w:r>
+              <w:rPr>
+                <w:rFonts w:ascii="Arial" w:eastAsia="Arial" w:hAnsi="Arial" w:cs="Arial"/>
+                <w:b/>
+                <w:color w:val="FFFFFF"/>
+                <w:sz w:val="26"/>
+                <w:szCs w:val="26"/>
+              </w:rPr>
+              <w:t>{</w:t>
+            </w:r>
+            <w:r>
+              <w:rPr>
+                <w:rFonts w:ascii="Arial" w:eastAsia="Arial" w:hAnsi="Arial" w:cs="Arial"/>
+                <w:b/>
+                <w:color w:val="FFFFFF"/>
+                <w:sz w:val="26"/>
+                <w:szCs w:val="26"/>
               </w:rPr>
               <w:t xml:space="preserve"> </w:t>
             </w:r>
-            <w:r>
-              <w:rPr>
-                <w:rFonts w:ascii="Arial" w:eastAsia="Arial" w:hAnsi="Arial" w:cs="Arial"/>
-                <w:b/>
-                <w:color w:val="FFFFFF"/>
-                <w:sz w:val="26"/>
-                <w:szCs w:val="26"/>
-                <w:lang w:val="en-GB"/>
+            <w:proofErr w:type="spellStart"/>
+            <w:r>
+              <w:rPr>
+                <w:rFonts w:ascii="Arial" w:eastAsia="Arial" w:hAnsi="Arial" w:cs="Arial"/>
+                <w:b/>
+                <w:color w:val="FFFFFF"/>
+                <w:sz w:val="26"/>
+                <w:szCs w:val="26"/>
               </w:rPr>
               <w:t>loop.index</w:t>
             </w:r>
-            <w:r>
-              <w:rPr>
-                <w:rFonts w:ascii="Arial" w:eastAsia="Arial" w:hAnsi="Arial" w:cs="Arial"/>
-                <w:b/>
-                <w:color w:val="FFFFFF"/>
-                <w:sz w:val="26"/>
-                <w:szCs w:val="26"/>
-                <w:lang w:val="en-GB"/>
+            <w:proofErr w:type="spellEnd"/>
+            <w:proofErr w:type="gramEnd"/>
+            <w:r>
+              <w:rPr>
+                <w:rFonts w:ascii="Arial" w:eastAsia="Arial" w:hAnsi="Arial" w:cs="Arial"/>
+                <w:b/>
+                <w:color w:val="FFFFFF"/>
+                <w:sz w:val="26"/>
+                <w:szCs w:val="26"/>
               </w:rPr>
               <w:t xml:space="preserve"> </w:t>
             </w:r>
@@ -1537,29 +1715,38 @@
                 <w:color w:val="FFFFFF"/>
                 <w:sz w:val="26"/>
                 <w:szCs w:val="26"/>
-                <w:lang w:val="en-GB"/>
-              </w:rPr>
-              <w:t>}} : {{ groupe.tit</w:t>
-            </w:r>
-            <w:r>
-              <w:rPr>
-                <w:rFonts w:ascii="Arial" w:eastAsia="Arial" w:hAnsi="Arial" w:cs="Arial"/>
-                <w:b/>
-                <w:color w:val="FFFFFF"/>
-                <w:sz w:val="26"/>
-                <w:szCs w:val="26"/>
-                <w:lang w:val="en-GB"/>
+              </w:rPr>
+              <w:t xml:space="preserve">}} : {{ </w:t>
+            </w:r>
+            <w:proofErr w:type="spellStart"/>
+            <w:r>
+              <w:rPr>
+                <w:rFonts w:ascii="Arial" w:eastAsia="Arial" w:hAnsi="Arial" w:cs="Arial"/>
+                <w:b/>
+                <w:color w:val="FFFFFF"/>
+                <w:sz w:val="26"/>
+                <w:szCs w:val="26"/>
+              </w:rPr>
+              <w:t>groupe.tit</w:t>
+            </w:r>
+            <w:r>
+              <w:rPr>
+                <w:rFonts w:ascii="Arial" w:eastAsia="Arial" w:hAnsi="Arial" w:cs="Arial"/>
+                <w:b/>
+                <w:color w:val="FFFFFF"/>
+                <w:sz w:val="26"/>
+                <w:szCs w:val="26"/>
               </w:rPr>
               <w:t>le</w:t>
             </w:r>
-            <w:r>
-              <w:rPr>
-                <w:rFonts w:ascii="Arial" w:eastAsia="Arial" w:hAnsi="Arial" w:cs="Arial"/>
-                <w:b/>
-                <w:color w:val="FFFFFF"/>
-                <w:sz w:val="26"/>
-                <w:szCs w:val="26"/>
-                <w:lang w:val="en-GB"/>
+            <w:proofErr w:type="spellEnd"/>
+            <w:r>
+              <w:rPr>
+                <w:rFonts w:ascii="Arial" w:eastAsia="Arial" w:hAnsi="Arial" w:cs="Arial"/>
+                <w:b/>
+                <w:color w:val="FFFFFF"/>
+                <w:sz w:val="26"/>
+                <w:szCs w:val="26"/>
               </w:rPr>
               <w:t xml:space="preserve"> }}</w:t>
             </w:r>
@@ -1600,7 +1787,6 @@
                 <w:szCs w:val="26"/>
                 <w:lang w:val="en-GB"/>
               </w:rPr>
-              <w:lastRenderedPageBreak/>
               <w:t xml:space="preserve">{%for phase in </w:t>
             </w:r>
             <w:proofErr w:type="spellStart"/>
@@ -1731,7 +1917,6 @@
                 <w:color w:val="021A32"/>
                 <w:sz w:val="26"/>
                 <w:szCs w:val="26"/>
-                <w:lang w:val="en-GB"/>
               </w:rPr>
             </w:pPr>
             <w:r>
@@ -1740,9 +1925,18 @@
                 <w:color w:val="021A32"/>
                 <w:sz w:val="26"/>
                 <w:szCs w:val="26"/>
-                <w:lang w:val="en-GB"/>
-              </w:rPr>
-              <w:t xml:space="preserve">{{ </w:t>
+              </w:rPr>
+              <w:t>{</w:t>
+            </w:r>
+            <w:proofErr w:type="gramStart"/>
+            <w:r>
+              <w:rPr>
+                <w:rFonts w:ascii="Arial" w:eastAsia="Arial" w:hAnsi="Arial" w:cs="Arial"/>
+                <w:color w:val="021A32"/>
+                <w:sz w:val="26"/>
+                <w:szCs w:val="26"/>
+              </w:rPr>
+              <w:t xml:space="preserve">{ </w:t>
             </w:r>
             <w:proofErr w:type="spellStart"/>
             <w:r>
@@ -1751,18 +1945,17 @@
                 <w:color w:val="021A32"/>
                 <w:sz w:val="26"/>
                 <w:szCs w:val="26"/>
-                <w:lang w:val="en-GB"/>
               </w:rPr>
               <w:t>phase.nbJEH</w:t>
             </w:r>
             <w:proofErr w:type="spellEnd"/>
-            <w:r>
-              <w:rPr>
-                <w:rFonts w:ascii="Arial" w:eastAsia="Arial" w:hAnsi="Arial" w:cs="Arial"/>
-                <w:color w:val="021A32"/>
-                <w:sz w:val="26"/>
-                <w:szCs w:val="26"/>
-                <w:lang w:val="en-GB"/>
+            <w:proofErr w:type="gramEnd"/>
+            <w:r>
+              <w:rPr>
+                <w:rFonts w:ascii="Arial" w:eastAsia="Arial" w:hAnsi="Arial" w:cs="Arial"/>
+                <w:color w:val="021A32"/>
+                <w:sz w:val="26"/>
+                <w:szCs w:val="26"/>
               </w:rPr>
               <w:t xml:space="preserve"> }}</w:t>
             </w:r>
@@ -1954,6 +2147,7 @@
                 <w:szCs w:val="26"/>
                 <w:lang w:val="en-GB"/>
               </w:rPr>
+              <w:lastRenderedPageBreak/>
               <w:t xml:space="preserve">{%if </w:t>
             </w:r>
             <w:proofErr w:type="spellStart"/>
@@ -2903,7 +3097,55 @@
                 <w:szCs w:val="26"/>
                 <w:lang w:val="en-GB"/>
               </w:rPr>
-              <w:t xml:space="preserve">{{ etude.totalPrice + etude.application_fees }} </w:t>
+              <w:t xml:space="preserve">{{ </w:t>
+            </w:r>
+            <w:proofErr w:type="spellStart"/>
+            <w:r>
+              <w:rPr>
+                <w:rFonts w:ascii="Arial" w:eastAsia="Arial" w:hAnsi="Arial" w:cs="Arial"/>
+                <w:b/>
+                <w:color w:val="FFFFFF"/>
+                <w:sz w:val="26"/>
+                <w:szCs w:val="26"/>
+                <w:lang w:val="en-GB"/>
+              </w:rPr>
+              <w:t>etude.totalPrice</w:t>
+            </w:r>
+            <w:proofErr w:type="spellEnd"/>
+            <w:r>
+              <w:rPr>
+                <w:rFonts w:ascii="Arial" w:eastAsia="Arial" w:hAnsi="Arial" w:cs="Arial"/>
+                <w:b/>
+                <w:color w:val="FFFFFF"/>
+                <w:sz w:val="26"/>
+                <w:szCs w:val="26"/>
+                <w:lang w:val="en-GB"/>
+              </w:rPr>
+              <w:t xml:space="preserve"> + </w:t>
+            </w:r>
+            <w:proofErr w:type="spellStart"/>
+            <w:r>
+              <w:rPr>
+                <w:rFonts w:ascii="Arial" w:eastAsia="Arial" w:hAnsi="Arial" w:cs="Arial"/>
+                <w:b/>
+                <w:color w:val="FFFFFF"/>
+                <w:sz w:val="26"/>
+                <w:szCs w:val="26"/>
+                <w:lang w:val="en-GB"/>
+              </w:rPr>
+              <w:t>etude.application_fees</w:t>
+            </w:r>
+            <w:proofErr w:type="spellEnd"/>
+            <w:r>
+              <w:rPr>
+                <w:rFonts w:ascii="Arial" w:eastAsia="Arial" w:hAnsi="Arial" w:cs="Arial"/>
+                <w:b/>
+                <w:color w:val="FFFFFF"/>
+                <w:sz w:val="26"/>
+                <w:szCs w:val="26"/>
+                <w:lang w:val="en-GB"/>
+              </w:rPr>
+              <w:t xml:space="preserve"> }} </w:t>
             </w:r>
             <w:r>
               <w:rPr>
@@ -2956,31 +3198,20 @@
                 <w:color w:val="FFFFFF"/>
                 <w:sz w:val="26"/>
                 <w:szCs w:val="26"/>
-              </w:rPr>
-              <w:t>{</w:t>
-            </w:r>
-            <w:proofErr w:type="gramStart"/>
-            <w:r>
-              <w:rPr>
-                <w:rFonts w:ascii="Arial" w:eastAsia="Arial" w:hAnsi="Arial" w:cs="Arial"/>
-                <w:b/>
-                <w:color w:val="FFFFFF"/>
-                <w:sz w:val="26"/>
-                <w:szCs w:val="26"/>
-              </w:rPr>
-              <w:t>{ (</w:t>
+                <w:lang w:val="en-GB"/>
+              </w:rPr>
+              <w:t>{{ (etude.</w:t>
             </w:r>
             <w:proofErr w:type="spellStart"/>
-            <w:proofErr w:type="gramEnd"/>
-            <w:r>
-              <w:rPr>
-                <w:rFonts w:ascii="Arial" w:eastAsia="Arial" w:hAnsi="Arial" w:cs="Arial"/>
-                <w:b/>
-                <w:color w:val="FFFFFF"/>
-                <w:sz w:val="26"/>
-                <w:szCs w:val="26"/>
-              </w:rPr>
-              <w:t>etude.totalPrice</w:t>
+            <w:r>
+              <w:rPr>
+                <w:rFonts w:ascii="Arial" w:eastAsia="Arial" w:hAnsi="Arial" w:cs="Arial"/>
+                <w:b/>
+                <w:color w:val="FFFFFF"/>
+                <w:sz w:val="26"/>
+                <w:szCs w:val="26"/>
+              </w:rPr>
+              <w:t>totalPrice</w:t>
             </w:r>
             <w:proofErr w:type="spellEnd"/>
             <w:r>
@@ -3550,23 +3781,7 @@
                 <w:sz w:val="20"/>
                 <w:szCs w:val="20"/>
               </w:rPr>
-              <w:t>.</w:t>
-            </w:r>
-            <w:r>
-              <w:rPr>
-                <w:rFonts w:ascii="Arial" w:eastAsia="Arial" w:hAnsi="Arial" w:cs="Arial"/>
-                <w:sz w:val="20"/>
-                <w:szCs w:val="20"/>
-              </w:rPr>
-              <w:t>last</w:t>
-            </w:r>
-            <w:r>
-              <w:rPr>
-                <w:rFonts w:ascii="Arial" w:eastAsia="Arial" w:hAnsi="Arial" w:cs="Arial"/>
-                <w:sz w:val="20"/>
-                <w:szCs w:val="20"/>
-              </w:rPr>
-              <w:t>name</w:t>
+              <w:t>.lastname</w:t>
             </w:r>
             <w:proofErr w:type="spellEnd"/>
             <w:r>

</xml_diff>